<commit_message>
New map area creation, unit conversion, landing page, manual update
</commit_message>
<xml_diff>
--- a/assets/templates/jegyzokonyv_template.docx
+++ b/assets/templates/jegyzokonyv_template.docx
@@ -796,6 +796,268 @@
     </w:p>
     <w:p>
       <w:pPr>
+        <w:pStyle w:val="Heading2"/>
+        <w:spacing w:after="120" w:before="200"/>
+      </w:pPr>
+      <w:r>
+        <w:t xml:space="preserve">Doziméterek</w:t>
+      </w:r>
+    </w:p>
+    <w:tbl>
+      <w:tblPr>
+        <w:tblW w:type="dxa" w:w="15398"/>
+        <w:tblBorders>
+          <w:top w:val="single" w:color="auto" w:sz="4"/>
+          <w:left w:val="single" w:color="auto" w:sz="4"/>
+          <w:bottom w:val="single" w:color="auto" w:sz="4"/>
+          <w:right w:val="single" w:color="auto" w:sz="4"/>
+          <w:insideH w:val="single" w:color="auto" w:sz="4"/>
+          <w:insideV w:val="single" w:color="auto" w:sz="4"/>
+        </w:tblBorders>
+      </w:tblPr>
+      <w:tblGrid>
+        <w:gridCol w:w="500"/>
+        <w:gridCol w:w="1600"/>
+        <w:gridCol w:w="2200"/>
+        <w:gridCol w:w="5000"/>
+        <w:gridCol w:w="1900"/>
+        <w:gridCol w:w="1900"/>
+        <w:gridCol w:w="2298"/>
+      </w:tblGrid>
+      <w:tr>
+        <w:trPr>
+          <w:tblHeader/>
+        </w:trPr>
+        <w:tc>
+          <w:tcPr>
+            <w:tcW w:type="dxa" w:w="500"/>
+            <w:shd w:fill="2F2F2F" w:val="clear"/>
+          </w:tcPr>
+          <w:p>
+            <w:r>
+              <w:rPr>
+                <w:b/>
+                <w:bCs/>
+                <w:color w:val="FFFFFF"/>
+                <w:sz w:val="18"/>
+                <w:szCs w:val="18"/>
+              </w:rPr>
+              <w:t xml:space="preserve">#</w:t>
+            </w:r>
+          </w:p>
+        </w:tc>
+        <w:tc>
+          <w:tcPr>
+            <w:tcW w:type="dxa" w:w="1600"/>
+            <w:shd w:fill="2F2F2F" w:val="clear"/>
+          </w:tcPr>
+          <w:p>
+            <w:r>
+              <w:rPr>
+                <w:b/>
+                <w:bCs/>
+                <w:color w:val="FFFFFF"/>
+                <w:sz w:val="18"/>
+                <w:szCs w:val="18"/>
+              </w:rPr>
+              <w:t xml:space="preserve">Típus</w:t>
+            </w:r>
+          </w:p>
+        </w:tc>
+        <w:tc>
+          <w:tcPr>
+            <w:tcW w:type="dxa" w:w="2200"/>
+            <w:shd w:fill="2F2F2F" w:val="clear"/>
+          </w:tcPr>
+          <w:p>
+            <w:r>
+              <w:rPr>
+                <w:b/>
+                <w:bCs/>
+                <w:color w:val="FFFFFF"/>
+                <w:sz w:val="18"/>
+                <w:szCs w:val="18"/>
+              </w:rPr>
+              <w:t xml:space="preserve">Azonosító</w:t>
+            </w:r>
+          </w:p>
+        </w:tc>
+        <w:tc>
+          <w:tcPr>
+            <w:tcW w:type="dxa" w:w="5000"/>
+            <w:shd w:fill="2F2F2F" w:val="clear"/>
+          </w:tcPr>
+          <w:p>
+            <w:r>
+              <w:rPr>
+                <w:b/>
+                <w:bCs/>
+                <w:color w:val="FFFFFF"/>
+                <w:sz w:val="18"/>
+                <w:szCs w:val="18"/>
+              </w:rPr>
+              <w:t xml:space="preserve">Viselő</w:t>
+            </w:r>
+          </w:p>
+        </w:tc>
+        <w:tc>
+          <w:tcPr>
+            <w:tcW w:type="dxa" w:w="1900"/>
+            <w:shd w:fill="2F2F2F" w:val="clear"/>
+          </w:tcPr>
+          <w:p>
+            <w:r>
+              <w:rPr>
+                <w:b/>
+                <w:bCs/>
+                <w:color w:val="FFFFFF"/>
+                <w:sz w:val="18"/>
+                <w:szCs w:val="18"/>
+              </w:rPr>
+              <w:t xml:space="preserve">Állás (kezdő → záró)</w:t>
+            </w:r>
+          </w:p>
+        </w:tc>
+        <w:tc>
+          <w:tcPr>
+            <w:tcW w:type="dxa" w:w="1900"/>
+            <w:shd w:fill="2F2F2F" w:val="clear"/>
+          </w:tcPr>
+          <w:p>
+            <w:r>
+              <w:rPr>
+                <w:b/>
+                <w:bCs/>
+                <w:color w:val="FFFFFF"/>
+                <w:sz w:val="18"/>
+                <w:szCs w:val="18"/>
+              </w:rPr>
+              <w:t xml:space="preserve">Dózis</w:t>
+            </w:r>
+          </w:p>
+        </w:tc>
+        <w:tc>
+          <w:tcPr>
+            <w:tcW w:type="dxa" w:w="2298"/>
+            <w:shd w:fill="2F2F2F" w:val="clear"/>
+          </w:tcPr>
+          <w:p>
+            <w:r>
+              <w:rPr>
+                <w:b/>
+                <w:bCs/>
+                <w:color w:val="FFFFFF"/>
+                <w:sz w:val="18"/>
+                <w:szCs w:val="18"/>
+              </w:rPr>
+              <w:t xml:space="preserve">Beszámít</w:t>
+            </w:r>
+          </w:p>
+        </w:tc>
+      </w:tr>
+      <w:tr>
+        <w:tc>
+          <w:tcPr>
+            <w:tcW w:type="dxa" w:w="500"/>
+          </w:tcPr>
+          <w:p>
+            <w:r>
+              <w:rPr>
+                <w:sz w:val="18"/>
+                <w:szCs w:val="18"/>
+              </w:rPr>
+              <w:t xml:space="preserve">${dosimeters.idx}</w:t>
+            </w:r>
+          </w:p>
+        </w:tc>
+        <w:tc>
+          <w:tcPr>
+            <w:tcW w:type="dxa" w:w="1600"/>
+          </w:tcPr>
+          <w:p>
+            <w:r>
+              <w:rPr>
+                <w:sz w:val="18"/>
+                <w:szCs w:val="18"/>
+              </w:rPr>
+              <w:t xml:space="preserve">${dosimeters.kind}</w:t>
+            </w:r>
+          </w:p>
+        </w:tc>
+        <w:tc>
+          <w:tcPr>
+            <w:tcW w:type="dxa" w:w="2200"/>
+          </w:tcPr>
+          <w:p>
+            <w:r>
+              <w:rPr>
+                <w:sz w:val="18"/>
+                <w:szCs w:val="18"/>
+              </w:rPr>
+              <w:t xml:space="preserve">${dosimeters.identifier}</w:t>
+            </w:r>
+          </w:p>
+        </w:tc>
+        <w:tc>
+          <w:tcPr>
+            <w:tcW w:type="dxa" w:w="5000"/>
+          </w:tcPr>
+          <w:p>
+            <w:r>
+              <w:rPr>
+                <w:sz w:val="18"/>
+                <w:szCs w:val="18"/>
+              </w:rPr>
+              <w:t xml:space="preserve">${dosimeters.person}</w:t>
+            </w:r>
+          </w:p>
+        </w:tc>
+        <w:tc>
+          <w:tcPr>
+            <w:tcW w:type="dxa" w:w="1900"/>
+          </w:tcPr>
+          <w:p>
+            <w:r>
+              <w:rPr>
+                <w:sz w:val="18"/>
+                <w:szCs w:val="18"/>
+              </w:rPr>
+              <w:t xml:space="preserve">${dosimeters.reading}</w:t>
+            </w:r>
+          </w:p>
+        </w:tc>
+        <w:tc>
+          <w:tcPr>
+            <w:tcW w:type="dxa" w:w="1900"/>
+          </w:tcPr>
+          <w:p>
+            <w:r>
+              <w:rPr>
+                <w:sz w:val="18"/>
+                <w:szCs w:val="18"/>
+              </w:rPr>
+              <w:t xml:space="preserve">${dosimeters.dose}</w:t>
+            </w:r>
+          </w:p>
+        </w:tc>
+        <w:tc>
+          <w:tcPr>
+            <w:tcW w:type="dxa" w:w="2298"/>
+          </w:tcPr>
+          <w:p>
+            <w:r>
+              <w:rPr>
+                <w:sz w:val="18"/>
+                <w:szCs w:val="18"/>
+              </w:rPr>
+              <w:t xml:space="preserve">${dosimeters.counted}</w:t>
+            </w:r>
+          </w:p>
+        </w:tc>
+      </w:tr>
+    </w:tbl>
+    <w:p>
+      <w:pPr>
         <w:spacing w:after="80" w:before="300"/>
       </w:pPr>
       <w:r>
@@ -807,6 +1069,21 @@
       </w:r>
       <w:r>
         <w:t xml:space="preserve">${surveyor_name}</w:t>
+      </w:r>
+    </w:p>
+    <w:p>
+      <w:pPr>
+        <w:spacing w:after="80" w:before="0"/>
+      </w:pPr>
+      <w:r>
+        <w:rPr>
+          <w:b/>
+          <w:bCs/>
+        </w:rPr>
+        <w:t xml:space="preserve">Cég: </w:t>
+      </w:r>
+      <w:r>
+        <w:t xml:space="preserve">${company_name}</w:t>
       </w:r>
     </w:p>
     <w:p>

</xml_diff>

<commit_message>
Report localisation and distance measurment on map.
</commit_message>
<xml_diff>
--- a/assets/templates/jegyzokonyv_template.docx
+++ b/assets/templates/jegyzokonyv_template.docx
@@ -8,7 +8,7 @@
         <w:spacing w:after="200"/>
       </w:pPr>
       <w:r>
-        <w:t xml:space="preserve">Terepi sugárzásmérési jegyzőkönyv</w:t>
+        <w:t xml:space="preserve">${lbl_title}</w:t>
       </w:r>
     </w:p>
     <w:p>
@@ -20,7 +20,7 @@
           <w:b/>
           <w:bCs/>
         </w:rPr>
-        <w:t xml:space="preserve">Felmérés megnevezése: </w:t>
+        <w:t xml:space="preserve">${lbl_survey_name}${lbl_colon}</w:t>
       </w:r>
       <w:r>
         <w:t xml:space="preserve">${survey_title}</w:t>
@@ -35,7 +35,7 @@
           <w:b/>
           <w:bCs/>
         </w:rPr>
-        <w:t xml:space="preserve">Helyszín: </w:t>
+        <w:t xml:space="preserve">${lbl_location}${lbl_colon}</w:t>
       </w:r>
       <w:r>
         <w:t xml:space="preserve">${survey_location}</w:t>
@@ -50,7 +50,7 @@
           <w:b/>
           <w:bCs/>
         </w:rPr>
-        <w:t xml:space="preserve">Felmérés kezdete: </w:t>
+        <w:t xml:space="preserve">${lbl_started}${lbl_colon}</w:t>
       </w:r>
       <w:r>
         <w:t xml:space="preserve">${survey_started}</w:t>
@@ -65,7 +65,7 @@
           <w:b/>
           <w:bCs/>
         </w:rPr>
-        <w:t xml:space="preserve">Felmérés lezárása: </w:t>
+        <w:t xml:space="preserve">${lbl_closed}${lbl_colon}</w:t>
       </w:r>
       <w:r>
         <w:t xml:space="preserve">${survey_closed}</w:t>
@@ -80,7 +80,7 @@
           <w:b/>
           <w:bCs/>
         </w:rPr>
-        <w:t xml:space="preserve">Megjegyzés: </w:t>
+        <w:t xml:space="preserve">${lbl_notes}${lbl_colon}</w:t>
       </w:r>
       <w:r>
         <w:t xml:space="preserve">${survey_notes}</w:t>
@@ -92,7 +92,7 @@
         <w:spacing w:after="120" w:before="200"/>
       </w:pPr>
       <w:r>
-        <w:t xml:space="preserve">Mérési pontok</w:t>
+        <w:t xml:space="preserve">${lbl_points_heading}</w:t>
       </w:r>
     </w:p>
     <w:tbl>
@@ -157,7 +157,7 @@
                 <w:sz w:val="18"/>
                 <w:szCs w:val="18"/>
               </w:rPr>
-              <w:t xml:space="preserve">Helyszín</w:t>
+              <w:t xml:space="preserve">${lbl_location}</w:t>
             </w:r>
           </w:p>
         </w:tc>
@@ -175,7 +175,7 @@
                 <w:sz w:val="18"/>
                 <w:szCs w:val="18"/>
               </w:rPr>
-              <w:t xml:space="preserve">Típus</w:t>
+              <w:t xml:space="preserve">${lbl_col_type}</w:t>
             </w:r>
           </w:p>
         </w:tc>
@@ -193,7 +193,7 @@
                 <w:sz w:val="18"/>
                 <w:szCs w:val="18"/>
               </w:rPr>
-              <w:t xml:space="preserve">Érték</w:t>
+              <w:t xml:space="preserve">${lbl_col_value}</w:t>
             </w:r>
           </w:p>
         </w:tc>
@@ -211,7 +211,7 @@
                 <w:sz w:val="18"/>
                 <w:szCs w:val="18"/>
               </w:rPr>
-              <w:t xml:space="preserve">Egység</w:t>
+              <w:t xml:space="preserve">${lbl_col_unit}</w:t>
             </w:r>
           </w:p>
         </w:tc>
@@ -229,7 +229,7 @@
                 <w:sz w:val="18"/>
                 <w:szCs w:val="18"/>
               </w:rPr>
-              <w:t xml:space="preserve">Táv. forrástól (m)</w:t>
+              <w:t xml:space="preserve">${lbl_col_distance}</w:t>
             </w:r>
           </w:p>
         </w:tc>
@@ -247,7 +247,7 @@
                 <w:sz w:val="18"/>
                 <w:szCs w:val="18"/>
               </w:rPr>
-              <w:t xml:space="preserve">Műszer</w:t>
+              <w:t xml:space="preserve">${lbl_col_instrument}</w:t>
             </w:r>
           </w:p>
         </w:tc>
@@ -265,7 +265,7 @@
                 <w:sz w:val="18"/>
                 <w:szCs w:val="18"/>
               </w:rPr>
-              <w:t xml:space="preserve">GPS koordináta</w:t>
+              <w:t xml:space="preserve">${lbl_col_gps}</w:t>
             </w:r>
           </w:p>
         </w:tc>
@@ -283,7 +283,7 @@
                 <w:sz w:val="18"/>
                 <w:szCs w:val="18"/>
               </w:rPr>
-              <w:t xml:space="preserve">GPS pontosság (m)</w:t>
+              <w:t xml:space="preserve">${lbl_col_gps_accuracy}</w:t>
             </w:r>
           </w:p>
         </w:tc>
@@ -301,7 +301,7 @@
                 <w:sz w:val="18"/>
                 <w:szCs w:val="18"/>
               </w:rPr>
-              <w:t xml:space="preserve">Időpont</w:t>
+              <w:t xml:space="preserve">${lbl_col_time}</w:t>
             </w:r>
           </w:p>
         </w:tc>
@@ -319,7 +319,7 @@
                 <w:sz w:val="18"/>
                 <w:szCs w:val="18"/>
               </w:rPr>
-              <w:t xml:space="preserve">Fénykép fájl</w:t>
+              <w:t xml:space="preserve">${lbl_col_photo}</w:t>
             </w:r>
           </w:p>
         </w:tc>
@@ -337,7 +337,7 @@
                 <w:sz w:val="18"/>
                 <w:szCs w:val="18"/>
               </w:rPr>
-              <w:t xml:space="preserve">Megjegyzés</w:t>
+              <w:t xml:space="preserve">${lbl_notes}</w:t>
             </w:r>
           </w:p>
         </w:tc>
@@ -519,7 +519,7 @@
         <w:spacing w:after="120" w:before="200"/>
       </w:pPr>
       <w:r>
-        <w:t xml:space="preserve">Sugárforrás-elemzés</w:t>
+        <w:t xml:space="preserve">${lbl_source_heading}</w:t>
       </w:r>
     </w:p>
     <w:tbl>
@@ -579,7 +579,7 @@
                 <w:sz w:val="18"/>
                 <w:szCs w:val="18"/>
               </w:rPr>
-              <w:t xml:space="preserve">Helyszín</w:t>
+              <w:t xml:space="preserve">${lbl_location}</w:t>
             </w:r>
           </w:p>
         </w:tc>
@@ -597,7 +597,7 @@
                 <w:sz w:val="18"/>
                 <w:szCs w:val="18"/>
               </w:rPr>
-              <w:t xml:space="preserve">Becsült aktivitás (mérésből)</w:t>
+              <w:t xml:space="preserve">${lbl_col_est_activity}</w:t>
             </w:r>
           </w:p>
         </w:tc>
@@ -615,7 +615,7 @@
                 <w:sz w:val="18"/>
                 <w:szCs w:val="18"/>
               </w:rPr>
-              <w:t xml:space="preserve">Hozzárendelt forrás(ok)</w:t>
+              <w:t xml:space="preserve">${lbl_col_attached}</w:t>
             </w:r>
           </w:p>
         </w:tc>
@@ -633,7 +633,7 @@
                 <w:sz w:val="18"/>
                 <w:szCs w:val="18"/>
               </w:rPr>
-              <w:t xml:space="preserve">Számított dózisteljesítmény</w:t>
+              <w:t xml:space="preserve">${lbl_col_calc_total}</w:t>
             </w:r>
           </w:p>
         </w:tc>
@@ -651,7 +651,7 @@
                 <w:sz w:val="18"/>
                 <w:szCs w:val="18"/>
               </w:rPr>
-              <w:t xml:space="preserve">Mért dózisteljesítmény</w:t>
+              <w:t xml:space="preserve">${lbl_col_measured}</w:t>
             </w:r>
           </w:p>
         </w:tc>
@@ -669,7 +669,7 @@
                 <w:sz w:val="18"/>
                 <w:szCs w:val="18"/>
               </w:rPr>
-              <w:t xml:space="preserve">Eltérés</w:t>
+              <w:t xml:space="preserve">${lbl_col_diff}</w:t>
             </w:r>
           </w:p>
         </w:tc>
@@ -786,7 +786,7 @@
           <w:sz w:val="16"/>
           <w:szCs w:val="16"/>
         </w:rPr>
-        <w:t xml:space="preserve">Csak a forrással vagy aktivitás-becsléssel rendelkező mérési pontok szerepelnek. A számított értékek tájékoztató jellegűek.</w:t>
+        <w:t xml:space="preserve">${lbl_source_note}</w:t>
       </w:r>
     </w:p>
     <w:p>
@@ -800,7 +800,7 @@
         <w:spacing w:after="120" w:before="200"/>
       </w:pPr>
       <w:r>
-        <w:t xml:space="preserve">Doziméterek</w:t>
+        <w:t xml:space="preserve">${lbl_dosimeter_heading}</w:t>
       </w:r>
     </w:p>
     <w:tbl>
@@ -860,7 +860,7 @@
                 <w:sz w:val="18"/>
                 <w:szCs w:val="18"/>
               </w:rPr>
-              <w:t xml:space="preserve">Típus</w:t>
+              <w:t xml:space="preserve">${lbl_col_type}</w:t>
             </w:r>
           </w:p>
         </w:tc>
@@ -878,7 +878,7 @@
                 <w:sz w:val="18"/>
                 <w:szCs w:val="18"/>
               </w:rPr>
-              <w:t xml:space="preserve">Azonosító</w:t>
+              <w:t xml:space="preserve">${lbl_col_identifier}</w:t>
             </w:r>
           </w:p>
         </w:tc>
@@ -896,7 +896,7 @@
                 <w:sz w:val="18"/>
                 <w:szCs w:val="18"/>
               </w:rPr>
-              <w:t xml:space="preserve">Viselő</w:t>
+              <w:t xml:space="preserve">${lbl_col_wearer}</w:t>
             </w:r>
           </w:p>
         </w:tc>
@@ -914,7 +914,7 @@
                 <w:sz w:val="18"/>
                 <w:szCs w:val="18"/>
               </w:rPr>
-              <w:t xml:space="preserve">Állás (kezdő → záró)</w:t>
+              <w:t xml:space="preserve">${lbl_col_reading}</w:t>
             </w:r>
           </w:p>
         </w:tc>
@@ -932,7 +932,7 @@
                 <w:sz w:val="18"/>
                 <w:szCs w:val="18"/>
               </w:rPr>
-              <w:t xml:space="preserve">Dózis</w:t>
+              <w:t xml:space="preserve">${lbl_col_dose}</w:t>
             </w:r>
           </w:p>
         </w:tc>
@@ -950,7 +950,7 @@
                 <w:sz w:val="18"/>
                 <w:szCs w:val="18"/>
               </w:rPr>
-              <w:t xml:space="preserve">Beszámít</w:t>
+              <w:t xml:space="preserve">${lbl_col_counted}</w:t>
             </w:r>
           </w:p>
         </w:tc>
@@ -1065,7 +1065,7 @@
           <w:b/>
           <w:bCs/>
         </w:rPr>
-        <w:t xml:space="preserve">Felmérést végezte: </w:t>
+        <w:t xml:space="preserve">${lbl_surveyed_by}${lbl_colon}</w:t>
       </w:r>
       <w:r>
         <w:t xml:space="preserve">${surveyor_name}</w:t>
@@ -1080,7 +1080,7 @@
           <w:b/>
           <w:bCs/>
         </w:rPr>
-        <w:t xml:space="preserve">Cég: </w:t>
+        <w:t xml:space="preserve">${lbl_company}${lbl_colon}</w:t>
       </w:r>
       <w:r>
         <w:t xml:space="preserve">${company_name}</w:t>
@@ -1092,7 +1092,7 @@
           <w:b/>
           <w:bCs/>
         </w:rPr>
-        <w:t xml:space="preserve">Dátum: </w:t>
+        <w:t xml:space="preserve">${lbl_date}${lbl_colon}</w:t>
       </w:r>
       <w:r>
         <w:t xml:space="preserve">${export_date}</w:t>
@@ -1107,7 +1107,7 @@
           <w:b/>
           <w:bCs/>
         </w:rPr>
-        <w:t xml:space="preserve">Aláírás: </w:t>
+        <w:t xml:space="preserve">${lbl_signature}${lbl_colon}</w:t>
       </w:r>
       <w:r>
         <w:t xml:space="preserve">_______________________</w:t>

</xml_diff>